<commit_message>
Updated 2 Meeting Notes
</commit_message>
<xml_diff>
--- a/Non Code Files/Meeting minutes/20.03.26 Stockle Meeting.docx
+++ b/Non Code Files/Meeting minutes/20.03.26 Stockle Meeting.docx
@@ -152,6 +152,14 @@
                 <w:szCs w:val="28"/>
               </w:rPr>
               <w:t xml:space="preserve"> </w:t>
+            </w:r>
+            <w:r>
+              <w:rPr>
+                <w:b/>
+                <w:sz w:val="28"/>
+                <w:szCs w:val="28"/>
+              </w:rPr>
+              <w:t>1 Hour</w:t>
             </w:r>
           </w:p>
           <w:p>

</xml_diff>